<commit_message>
doc stage status update - stage 13 complete
</commit_message>
<xml_diff>
--- a/cppTDGL/docs/CppTDGL Application Design and Stage Plan.docx
+++ b/cppTDGL/docs/CppTDGL Application Design and Stage Plan.docx
@@ -1390,7 +1390,7 @@
         </w:trPr>
         <w:tc>
           <w:tcPr>
-            <w:tcW w:w="2436" w:type="dxa"/>
+            <w:tcW w:w="2946" w:type="dxa"/>
           </w:tcPr>
           <w:p>
             <w:pPr>
@@ -1404,7 +1404,7 @@
         </w:tc>
         <w:tc>
           <w:tcPr>
-            <w:tcW w:w="1827" w:type="dxa"/>
+            <w:tcW w:w="2210" w:type="dxa"/>
           </w:tcPr>
           <w:p>
             <w:pPr>
@@ -1417,7 +1417,7 @@
         </w:tc>
         <w:tc>
           <w:tcPr>
-            <w:tcW w:w="1827" w:type="dxa"/>
+            <w:tcW w:w="2210" w:type="dxa"/>
           </w:tcPr>
           <w:p>
             <w:pPr>
@@ -1430,7 +1430,7 @@
         </w:tc>
         <w:tc>
           <w:tcPr>
-            <w:tcW w:w="1827" w:type="dxa"/>
+            <w:tcW w:w="2210" w:type="dxa"/>
           </w:tcPr>
           <w:p>
             <w:pPr>
@@ -1445,7 +1445,7 @@
       <w:tr>
         <w:tc>
           <w:tcPr>
-            <w:tcW w:w="2436" w:type="dxa"/>
+            <w:tcW w:w="2946" w:type="dxa"/>
           </w:tcPr>
           <w:p>
             <w:pPr>
@@ -1460,7 +1460,7 @@
         </w:tc>
         <w:tc>
           <w:tcPr>
-            <w:tcW w:w="1827" w:type="dxa"/>
+            <w:tcW w:w="2210" w:type="dxa"/>
           </w:tcPr>
           <w:p>
             <w:pPr>
@@ -1473,7 +1473,7 @@
         </w:tc>
         <w:tc>
           <w:tcPr>
-            <w:tcW w:w="1827" w:type="dxa"/>
+            <w:tcW w:w="2210" w:type="dxa"/>
           </w:tcPr>
           <w:p>
             <w:pPr>
@@ -1486,7 +1486,7 @@
         </w:tc>
         <w:tc>
           <w:tcPr>
-            <w:tcW w:w="1827" w:type="dxa"/>
+            <w:tcW w:w="2210" w:type="dxa"/>
           </w:tcPr>
           <w:p>
             <w:pPr>
@@ -1501,7 +1501,7 @@
       <w:tr>
         <w:tc>
           <w:tcPr>
-            <w:tcW w:w="2436" w:type="dxa"/>
+            <w:tcW w:w="2946" w:type="dxa"/>
           </w:tcPr>
           <w:p>
             <w:pPr>
@@ -1515,7 +1515,7 @@
         </w:tc>
         <w:tc>
           <w:tcPr>
-            <w:tcW w:w="1827" w:type="dxa"/>
+            <w:tcW w:w="2210" w:type="dxa"/>
           </w:tcPr>
           <w:p>
             <w:pPr>
@@ -1528,7 +1528,7 @@
         </w:tc>
         <w:tc>
           <w:tcPr>
-            <w:tcW w:w="1827" w:type="dxa"/>
+            <w:tcW w:w="2210" w:type="dxa"/>
           </w:tcPr>
           <w:p>
             <w:pPr>
@@ -1586,7 +1586,7 @@
         </w:tc>
         <w:tc>
           <w:tcPr>
-            <w:tcW w:w="1827" w:type="dxa"/>
+            <w:tcW w:w="2210" w:type="dxa"/>
           </w:tcPr>
           <w:p>
             <w:pPr>
@@ -1601,7 +1601,7 @@
       <w:tr>
         <w:tc>
           <w:tcPr>
-            <w:tcW w:w="2436" w:type="dxa"/>
+            <w:tcW w:w="2946" w:type="dxa"/>
           </w:tcPr>
           <w:p>
             <w:pPr>
@@ -1615,7 +1615,7 @@
         </w:tc>
         <w:tc>
           <w:tcPr>
-            <w:tcW w:w="1827" w:type="dxa"/>
+            <w:tcW w:w="2210" w:type="dxa"/>
           </w:tcPr>
           <w:p>
             <w:pPr>
@@ -1628,7 +1628,7 @@
         </w:tc>
         <w:tc>
           <w:tcPr>
-            <w:tcW w:w="1827" w:type="dxa"/>
+            <w:tcW w:w="2210" w:type="dxa"/>
           </w:tcPr>
           <w:p>
             <w:pPr>
@@ -1695,7 +1695,7 @@
         </w:tc>
         <w:tc>
           <w:tcPr>
-            <w:tcW w:w="1827" w:type="dxa"/>
+            <w:tcW w:w="2210" w:type="dxa"/>
           </w:tcPr>
           <w:p>
             <w:pPr>
@@ -1710,7 +1710,7 @@
       <w:tr>
         <w:tc>
           <w:tcPr>
-            <w:tcW w:w="2436" w:type="dxa"/>
+            <w:tcW w:w="2946" w:type="dxa"/>
           </w:tcPr>
           <w:p>
             <w:pPr>
@@ -1724,7 +1724,7 @@
         </w:tc>
         <w:tc>
           <w:tcPr>
-            <w:tcW w:w="1827" w:type="dxa"/>
+            <w:tcW w:w="2210" w:type="dxa"/>
           </w:tcPr>
           <w:p>
             <w:pPr>
@@ -1737,7 +1737,7 @@
         </w:tc>
         <w:tc>
           <w:tcPr>
-            <w:tcW w:w="1827" w:type="dxa"/>
+            <w:tcW w:w="2210" w:type="dxa"/>
           </w:tcPr>
           <w:p>
             <w:pPr>
@@ -1768,7 +1768,7 @@
         </w:tc>
         <w:tc>
           <w:tcPr>
-            <w:tcW w:w="1827" w:type="dxa"/>
+            <w:tcW w:w="2210" w:type="dxa"/>
           </w:tcPr>
           <w:p>
             <w:pPr>
@@ -1783,7 +1783,7 @@
       <w:tr>
         <w:tc>
           <w:tcPr>
-            <w:tcW w:w="2436" w:type="dxa"/>
+            <w:tcW w:w="2946" w:type="dxa"/>
           </w:tcPr>
           <w:p>
             <w:pPr>
@@ -1797,7 +1797,7 @@
         </w:tc>
         <w:tc>
           <w:tcPr>
-            <w:tcW w:w="1827" w:type="dxa"/>
+            <w:tcW w:w="2210" w:type="dxa"/>
           </w:tcPr>
           <w:p>
             <w:pPr>
@@ -1810,7 +1810,7 @@
         </w:tc>
         <w:tc>
           <w:tcPr>
-            <w:tcW w:w="1827" w:type="dxa"/>
+            <w:tcW w:w="2210" w:type="dxa"/>
           </w:tcPr>
           <w:p>
             <w:pPr>
@@ -1863,7 +1863,7 @@
         </w:tc>
         <w:tc>
           <w:tcPr>
-            <w:tcW w:w="1827" w:type="dxa"/>
+            <w:tcW w:w="2210" w:type="dxa"/>
           </w:tcPr>
           <w:p>
             <w:pPr>
@@ -1879,7 +1879,7 @@
       <w:tr>
         <w:tc>
           <w:tcPr>
-            <w:tcW w:w="2436" w:type="dxa"/>
+            <w:tcW w:w="2946" w:type="dxa"/>
           </w:tcPr>
           <w:p>
             <w:pPr>
@@ -1893,7 +1893,7 @@
         </w:tc>
         <w:tc>
           <w:tcPr>
-            <w:tcW w:w="1827" w:type="dxa"/>
+            <w:tcW w:w="2210" w:type="dxa"/>
           </w:tcPr>
           <w:p>
             <w:pPr>
@@ -1906,7 +1906,7 @@
         </w:tc>
         <w:tc>
           <w:tcPr>
-            <w:tcW w:w="1827" w:type="dxa"/>
+            <w:tcW w:w="2210" w:type="dxa"/>
           </w:tcPr>
           <w:p>
             <w:pPr>
@@ -1928,7 +1928,7 @@
         </w:tc>
         <w:tc>
           <w:tcPr>
-            <w:tcW w:w="1827" w:type="dxa"/>
+            <w:tcW w:w="2210" w:type="dxa"/>
           </w:tcPr>
           <w:p>
             <w:pPr>
@@ -1943,7 +1943,7 @@
       <w:tr>
         <w:tc>
           <w:tcPr>
-            <w:tcW w:w="2436" w:type="dxa"/>
+            <w:tcW w:w="2946" w:type="dxa"/>
           </w:tcPr>
           <w:p>
             <w:pPr>
@@ -1957,7 +1957,7 @@
         </w:tc>
         <w:tc>
           <w:tcPr>
-            <w:tcW w:w="1827" w:type="dxa"/>
+            <w:tcW w:w="2210" w:type="dxa"/>
           </w:tcPr>
           <w:p>
             <w:pPr>
@@ -1970,7 +1970,7 @@
         </w:tc>
         <w:tc>
           <w:tcPr>
-            <w:tcW w:w="1827" w:type="dxa"/>
+            <w:tcW w:w="2210" w:type="dxa"/>
           </w:tcPr>
           <w:p>
             <w:pPr>
@@ -2001,7 +2001,7 @@
         </w:tc>
         <w:tc>
           <w:tcPr>
-            <w:tcW w:w="1827" w:type="dxa"/>
+            <w:tcW w:w="2210" w:type="dxa"/>
           </w:tcPr>
           <w:p>
             <w:pPr>
@@ -2016,7 +2016,7 @@
       <w:tr>
         <w:tc>
           <w:tcPr>
-            <w:tcW w:w="2436" w:type="dxa"/>
+            <w:tcW w:w="2946" w:type="dxa"/>
           </w:tcPr>
           <w:p>
             <w:pPr>
@@ -2030,7 +2030,7 @@
         </w:tc>
         <w:tc>
           <w:tcPr>
-            <w:tcW w:w="1827" w:type="dxa"/>
+            <w:tcW w:w="2210" w:type="dxa"/>
           </w:tcPr>
           <w:p>
             <w:pPr>
@@ -2043,7 +2043,7 @@
         </w:tc>
         <w:tc>
           <w:tcPr>
-            <w:tcW w:w="1827" w:type="dxa"/>
+            <w:tcW w:w="2210" w:type="dxa"/>
           </w:tcPr>
           <w:p>
             <w:pPr>
@@ -2065,7 +2065,7 @@
         </w:tc>
         <w:tc>
           <w:tcPr>
-            <w:tcW w:w="1827" w:type="dxa"/>
+            <w:tcW w:w="2210" w:type="dxa"/>
           </w:tcPr>
           <w:p>
             <w:pPr>
@@ -2080,7 +2080,7 @@
       <w:tr>
         <w:tc>
           <w:tcPr>
-            <w:tcW w:w="2436" w:type="dxa"/>
+            <w:tcW w:w="2946" w:type="dxa"/>
           </w:tcPr>
           <w:p>
             <w:pPr>
@@ -2094,7 +2094,7 @@
         </w:tc>
         <w:tc>
           <w:tcPr>
-            <w:tcW w:w="1827" w:type="dxa"/>
+            <w:tcW w:w="2210" w:type="dxa"/>
           </w:tcPr>
           <w:p>
             <w:pPr>
@@ -2107,7 +2107,7 @@
         </w:tc>
         <w:tc>
           <w:tcPr>
-            <w:tcW w:w="1827" w:type="dxa"/>
+            <w:tcW w:w="2210" w:type="dxa"/>
           </w:tcPr>
           <w:p>
             <w:pPr>
@@ -2133,7 +2133,7 @@
         </w:tc>
         <w:tc>
           <w:tcPr>
-            <w:tcW w:w="1827" w:type="dxa"/>
+            <w:tcW w:w="2210" w:type="dxa"/>
           </w:tcPr>
           <w:p>
             <w:pPr>
@@ -2149,7 +2149,7 @@
       <w:tr>
         <w:tc>
           <w:tcPr>
-            <w:tcW w:w="2436" w:type="dxa"/>
+            <w:tcW w:w="2946" w:type="dxa"/>
           </w:tcPr>
           <w:p>
             <w:pPr>
@@ -2163,7 +2163,7 @@
         </w:tc>
         <w:tc>
           <w:tcPr>
-            <w:tcW w:w="1827" w:type="dxa"/>
+            <w:tcW w:w="2210" w:type="dxa"/>
           </w:tcPr>
           <w:p>
             <w:pPr>
@@ -2176,7 +2176,7 @@
         </w:tc>
         <w:tc>
           <w:tcPr>
-            <w:tcW w:w="1827" w:type="dxa"/>
+            <w:tcW w:w="2210" w:type="dxa"/>
           </w:tcPr>
           <w:p>
             <w:pPr>
@@ -2207,7 +2207,7 @@
         </w:tc>
         <w:tc>
           <w:tcPr>
-            <w:tcW w:w="1827" w:type="dxa"/>
+            <w:tcW w:w="2210" w:type="dxa"/>
           </w:tcPr>
           <w:p>
             <w:pPr>
@@ -2222,7 +2222,7 @@
       <w:tr>
         <w:tc>
           <w:tcPr>
-            <w:tcW w:w="2436" w:type="dxa"/>
+            <w:tcW w:w="2946" w:type="dxa"/>
           </w:tcPr>
           <w:p>
             <w:pPr>
@@ -2236,7 +2236,7 @@
         </w:tc>
         <w:tc>
           <w:tcPr>
-            <w:tcW w:w="1827" w:type="dxa"/>
+            <w:tcW w:w="2210" w:type="dxa"/>
           </w:tcPr>
           <w:p>
             <w:pPr>
@@ -2249,7 +2249,7 @@
         </w:tc>
         <w:tc>
           <w:tcPr>
-            <w:tcW w:w="1827" w:type="dxa"/>
+            <w:tcW w:w="2210" w:type="dxa"/>
           </w:tcPr>
           <w:p>
             <w:pPr>
@@ -2325,14 +2325,14 @@
         </w:tc>
         <w:tc>
           <w:tcPr>
-            <w:tcW w:w="1827" w:type="dxa"/>
-          </w:tcPr>
-          <w:p>
-            <w:pPr>
-              <w:pStyle w:val="Compact"/>
-            </w:pPr>
-            <w:r>
-              <w:t>Done</w:t>
+            <w:tcW w:w="2210" w:type="dxa"/>
+          </w:tcPr>
+          <w:p>
+            <w:pPr>
+              <w:pStyle w:val="Compact"/>
+            </w:pPr>
+            <w:r>
+              <w:t>Done and merged</w:t>
             </w:r>
           </w:p>
         </w:tc>
@@ -2340,7 +2340,7 @@
       <w:tr>
         <w:tc>
           <w:tcPr>
-            <w:tcW w:w="2436" w:type="dxa"/>
+            <w:tcW w:w="2946" w:type="dxa"/>
           </w:tcPr>
           <w:p>
             <w:pPr>
@@ -2354,7 +2354,7 @@
         </w:tc>
         <w:tc>
           <w:tcPr>
-            <w:tcW w:w="1827" w:type="dxa"/>
+            <w:tcW w:w="2210" w:type="dxa"/>
           </w:tcPr>
           <w:p>
             <w:pPr>
@@ -2367,7 +2367,7 @@
         </w:tc>
         <w:tc>
           <w:tcPr>
-            <w:tcW w:w="1827" w:type="dxa"/>
+            <w:tcW w:w="2210" w:type="dxa"/>
           </w:tcPr>
           <w:p>
             <w:pPr>
@@ -2407,14 +2407,14 @@
         </w:tc>
         <w:tc>
           <w:tcPr>
-            <w:tcW w:w="1827" w:type="dxa"/>
-          </w:tcPr>
-          <w:p>
-            <w:pPr>
-              <w:pStyle w:val="Compact"/>
-            </w:pPr>
-            <w:r>
-              <w:t>In Progress</w:t>
+            <w:tcW w:w="2210" w:type="dxa"/>
+          </w:tcPr>
+          <w:p>
+            <w:pPr>
+              <w:pStyle w:val="Compact"/>
+            </w:pPr>
+            <w:r>
+              <w:t>Done and merged</w:t>
             </w:r>
           </w:p>
         </w:tc>
@@ -2422,7 +2422,7 @@
       <w:tr>
         <w:tc>
           <w:tcPr>
-            <w:tcW w:w="2436" w:type="dxa"/>
+            <w:tcW w:w="2946" w:type="dxa"/>
           </w:tcPr>
           <w:p>
             <w:pPr>
@@ -2436,7 +2436,7 @@
         </w:tc>
         <w:tc>
           <w:tcPr>
-            <w:tcW w:w="1827" w:type="dxa"/>
+            <w:tcW w:w="2210" w:type="dxa"/>
           </w:tcPr>
           <w:p>
             <w:pPr>
@@ -2449,7 +2449,7 @@
         </w:tc>
         <w:tc>
           <w:tcPr>
-            <w:tcW w:w="1827" w:type="dxa"/>
+            <w:tcW w:w="2210" w:type="dxa"/>
           </w:tcPr>
           <w:p>
             <w:pPr>
@@ -2462,14 +2462,14 @@
         </w:tc>
         <w:tc>
           <w:tcPr>
-            <w:tcW w:w="1827" w:type="dxa"/>
-          </w:tcPr>
-          <w:p>
-            <w:pPr>
-              <w:pStyle w:val="Compact"/>
-            </w:pPr>
-            <w:r>
-              <w:t>Planned</w:t>
+            <w:tcW w:w="2210" w:type="dxa"/>
+          </w:tcPr>
+          <w:p>
+            <w:pPr>
+              <w:pStyle w:val="Compact"/>
+            </w:pPr>
+            <w:r>
+              <w:t>Done and merged</w:t>
             </w:r>
           </w:p>
         </w:tc>
@@ -2477,7 +2477,7 @@
       <w:tr>
         <w:tc>
           <w:tcPr>
-            <w:tcW w:w="2436" w:type="dxa"/>
+            <w:tcW w:w="2946" w:type="dxa"/>
           </w:tcPr>
           <w:p>
             <w:pPr>
@@ -2492,7 +2492,7 @@
         </w:tc>
         <w:tc>
           <w:tcPr>
-            <w:tcW w:w="1827" w:type="dxa"/>
+            <w:tcW w:w="2210" w:type="dxa"/>
           </w:tcPr>
           <w:p>
             <w:pPr>
@@ -2505,7 +2505,7 @@
         </w:tc>
         <w:tc>
           <w:tcPr>
-            <w:tcW w:w="1827" w:type="dxa"/>
+            <w:tcW w:w="2210" w:type="dxa"/>
           </w:tcPr>
           <w:p>
             <w:pPr>
@@ -2518,14 +2518,14 @@
         </w:tc>
         <w:tc>
           <w:tcPr>
-            <w:tcW w:w="1827" w:type="dxa"/>
-          </w:tcPr>
-          <w:p>
-            <w:pPr>
-              <w:pStyle w:val="Compact"/>
-            </w:pPr>
-            <w:r>
-              <w:t>Planned</w:t>
+            <w:tcW w:w="2210" w:type="dxa"/>
+          </w:tcPr>
+          <w:p>
+            <w:pPr>
+              <w:pStyle w:val="Compact"/>
+            </w:pPr>
+            <w:r>
+              <w:t>Next</w:t>
             </w:r>
           </w:p>
         </w:tc>
@@ -2533,7 +2533,7 @@
       <w:tr>
         <w:tc>
           <w:tcPr>
-            <w:tcW w:w="2436" w:type="dxa"/>
+            <w:tcW w:w="2946" w:type="dxa"/>
           </w:tcPr>
           <w:p>
             <w:pPr>
@@ -2547,7 +2547,7 @@
         </w:tc>
         <w:tc>
           <w:tcPr>
-            <w:tcW w:w="1827" w:type="dxa"/>
+            <w:tcW w:w="2210" w:type="dxa"/>
           </w:tcPr>
           <w:p>
             <w:pPr>
@@ -2560,7 +2560,7 @@
         </w:tc>
         <w:tc>
           <w:tcPr>
-            <w:tcW w:w="1827" w:type="dxa"/>
+            <w:tcW w:w="2210" w:type="dxa"/>
           </w:tcPr>
           <w:p>
             <w:pPr>
@@ -2573,7 +2573,7 @@
         </w:tc>
         <w:tc>
           <w:tcPr>
-            <w:tcW w:w="1827" w:type="dxa"/>
+            <w:tcW w:w="2210" w:type="dxa"/>
           </w:tcPr>
           <w:p>
             <w:pPr>
@@ -2588,7 +2588,7 @@
       <w:tr>
         <w:tc>
           <w:tcPr>
-            <w:tcW w:w="2436" w:type="dxa"/>
+            <w:tcW w:w="2946" w:type="dxa"/>
           </w:tcPr>
           <w:p>
             <w:pPr>
@@ -2602,7 +2602,7 @@
         </w:tc>
         <w:tc>
           <w:tcPr>
-            <w:tcW w:w="1827" w:type="dxa"/>
+            <w:tcW w:w="2210" w:type="dxa"/>
           </w:tcPr>
           <w:p>
             <w:pPr>
@@ -2615,7 +2615,7 @@
         </w:tc>
         <w:tc>
           <w:tcPr>
-            <w:tcW w:w="1827" w:type="dxa"/>
+            <w:tcW w:w="2210" w:type="dxa"/>
           </w:tcPr>
           <w:p>
             <w:pPr>
@@ -2655,7 +2655,7 @@
         </w:tc>
         <w:tc>
           <w:tcPr>
-            <w:tcW w:w="1827" w:type="dxa"/>
+            <w:tcW w:w="2210" w:type="dxa"/>
           </w:tcPr>
           <w:p>
             <w:pPr>
@@ -2670,7 +2670,7 @@
       <w:tr>
         <w:tc>
           <w:tcPr>
-            <w:tcW w:w="2436" w:type="dxa"/>
+            <w:tcW w:w="2946" w:type="dxa"/>
           </w:tcPr>
           <w:p>
             <w:pPr>
@@ -2684,7 +2684,7 @@
         </w:tc>
         <w:tc>
           <w:tcPr>
-            <w:tcW w:w="1827" w:type="dxa"/>
+            <w:tcW w:w="2210" w:type="dxa"/>
           </w:tcPr>
           <w:p>
             <w:pPr>
@@ -2697,7 +2697,7 @@
         </w:tc>
         <w:tc>
           <w:tcPr>
-            <w:tcW w:w="1827" w:type="dxa"/>
+            <w:tcW w:w="2210" w:type="dxa"/>
           </w:tcPr>
           <w:p>
             <w:pPr>
@@ -2719,7 +2719,7 @@
         </w:tc>
         <w:tc>
           <w:tcPr>
-            <w:tcW w:w="1827" w:type="dxa"/>
+            <w:tcW w:w="2210" w:type="dxa"/>
           </w:tcPr>
           <w:p>
             <w:pPr>
@@ -2734,7 +2734,7 @@
       <w:tr>
         <w:tc>
           <w:tcPr>
-            <w:tcW w:w="2436" w:type="dxa"/>
+            <w:tcW w:w="2946" w:type="dxa"/>
           </w:tcPr>
           <w:p>
             <w:pPr>
@@ -2748,7 +2748,7 @@
         </w:tc>
         <w:tc>
           <w:tcPr>
-            <w:tcW w:w="1827" w:type="dxa"/>
+            <w:tcW w:w="2210" w:type="dxa"/>
           </w:tcPr>
           <w:p>
             <w:pPr>
@@ -2761,7 +2761,7 @@
         </w:tc>
         <w:tc>
           <w:tcPr>
-            <w:tcW w:w="1827" w:type="dxa"/>
+            <w:tcW w:w="2210" w:type="dxa"/>
           </w:tcPr>
           <w:p>
             <w:pPr>
@@ -2801,7 +2801,7 @@
         </w:tc>
         <w:tc>
           <w:tcPr>
-            <w:tcW w:w="1827" w:type="dxa"/>
+            <w:tcW w:w="2210" w:type="dxa"/>
           </w:tcPr>
           <w:p>
             <w:pPr>
@@ -2816,7 +2816,7 @@
       <w:tr>
         <w:tc>
           <w:tcPr>
-            <w:tcW w:w="2436" w:type="dxa"/>
+            <w:tcW w:w="2946" w:type="dxa"/>
           </w:tcPr>
           <w:p>
             <w:pPr>
@@ -2830,7 +2830,7 @@
         </w:tc>
         <w:tc>
           <w:tcPr>
-            <w:tcW w:w="1827" w:type="dxa"/>
+            <w:tcW w:w="2210" w:type="dxa"/>
           </w:tcPr>
           <w:p>
             <w:pPr>
@@ -2843,7 +2843,7 @@
         </w:tc>
         <w:tc>
           <w:tcPr>
-            <w:tcW w:w="1827" w:type="dxa"/>
+            <w:tcW w:w="2210" w:type="dxa"/>
           </w:tcPr>
           <w:p>
             <w:pPr>
@@ -2884,7 +2884,7 @@
         </w:tc>
         <w:tc>
           <w:tcPr>
-            <w:tcW w:w="1827" w:type="dxa"/>
+            <w:tcW w:w="2210" w:type="dxa"/>
           </w:tcPr>
           <w:p>
             <w:pPr>
@@ -2900,7 +2900,7 @@
       <w:tr>
         <w:tc>
           <w:tcPr>
-            <w:tcW w:w="2436" w:type="dxa"/>
+            <w:tcW w:w="2946" w:type="dxa"/>
           </w:tcPr>
           <w:p>
             <w:pPr>
@@ -2914,7 +2914,7 @@
         </w:tc>
         <w:tc>
           <w:tcPr>
-            <w:tcW w:w="1827" w:type="dxa"/>
+            <w:tcW w:w="2210" w:type="dxa"/>
           </w:tcPr>
           <w:p>
             <w:pPr>
@@ -2927,7 +2927,7 @@
         </w:tc>
         <w:tc>
           <w:tcPr>
-            <w:tcW w:w="1827" w:type="dxa"/>
+            <w:tcW w:w="2210" w:type="dxa"/>
           </w:tcPr>
           <w:p>
             <w:pPr>
@@ -2940,7 +2940,7 @@
         </w:tc>
         <w:tc>
           <w:tcPr>
-            <w:tcW w:w="1827" w:type="dxa"/>
+            <w:tcW w:w="2210" w:type="dxa"/>
           </w:tcPr>
           <w:p>
             <w:pPr>
@@ -2955,7 +2955,7 @@
       <w:tr>
         <w:tc>
           <w:tcPr>
-            <w:tcW w:w="2436" w:type="dxa"/>
+            <w:tcW w:w="2946" w:type="dxa"/>
           </w:tcPr>
           <w:p>
             <w:pPr>
@@ -2969,7 +2969,7 @@
         </w:tc>
         <w:tc>
           <w:tcPr>
-            <w:tcW w:w="1827" w:type="dxa"/>
+            <w:tcW w:w="2210" w:type="dxa"/>
           </w:tcPr>
           <w:p>
             <w:pPr>
@@ -2982,7 +2982,7 @@
         </w:tc>
         <w:tc>
           <w:tcPr>
-            <w:tcW w:w="1827" w:type="dxa"/>
+            <w:tcW w:w="2210" w:type="dxa"/>
           </w:tcPr>
           <w:p>
             <w:pPr>
@@ -3013,7 +3013,7 @@
         </w:tc>
         <w:tc>
           <w:tcPr>
-            <w:tcW w:w="1827" w:type="dxa"/>
+            <w:tcW w:w="2210" w:type="dxa"/>
           </w:tcPr>
           <w:p>
             <w:pPr>
@@ -3028,7 +3028,7 @@
       <w:tr>
         <w:tc>
           <w:tcPr>
-            <w:tcW w:w="2436" w:type="dxa"/>
+            <w:tcW w:w="2946" w:type="dxa"/>
           </w:tcPr>
           <w:p>
             <w:pPr>
@@ -3042,7 +3042,7 @@
         </w:tc>
         <w:tc>
           <w:tcPr>
-            <w:tcW w:w="1827" w:type="dxa"/>
+            <w:tcW w:w="2210" w:type="dxa"/>
           </w:tcPr>
           <w:p>
             <w:pPr>
@@ -3055,7 +3055,7 @@
         </w:tc>
         <w:tc>
           <w:tcPr>
-            <w:tcW w:w="1827" w:type="dxa"/>
+            <w:tcW w:w="2210" w:type="dxa"/>
           </w:tcPr>
           <w:p>
             <w:pPr>
@@ -3068,7 +3068,7 @@
         </w:tc>
         <w:tc>
           <w:tcPr>
-            <w:tcW w:w="1827" w:type="dxa"/>
+            <w:tcW w:w="2210" w:type="dxa"/>
           </w:tcPr>
           <w:p>
             <w:pPr>
@@ -3083,7 +3083,7 @@
       <w:tr>
         <w:tc>
           <w:tcPr>
-            <w:tcW w:w="2436" w:type="dxa"/>
+            <w:tcW w:w="2946" w:type="dxa"/>
           </w:tcPr>
           <w:p>
             <w:pPr>
@@ -3097,7 +3097,7 @@
         </w:tc>
         <w:tc>
           <w:tcPr>
-            <w:tcW w:w="1827" w:type="dxa"/>
+            <w:tcW w:w="2210" w:type="dxa"/>
           </w:tcPr>
           <w:p>
             <w:pPr>
@@ -3110,7 +3110,7 @@
         </w:tc>
         <w:tc>
           <w:tcPr>
-            <w:tcW w:w="1827" w:type="dxa"/>
+            <w:tcW w:w="2210" w:type="dxa"/>
           </w:tcPr>
           <w:p>
             <w:pPr>
@@ -3123,7 +3123,7 @@
         </w:tc>
         <w:tc>
           <w:tcPr>
-            <w:tcW w:w="1827" w:type="dxa"/>
+            <w:tcW w:w="2210" w:type="dxa"/>
           </w:tcPr>
           <w:p>
             <w:pPr>
@@ -3138,7 +3138,7 @@
       <w:tr>
         <w:tc>
           <w:tcPr>
-            <w:tcW w:w="2436" w:type="dxa"/>
+            <w:tcW w:w="2946" w:type="dxa"/>
           </w:tcPr>
           <w:p>
             <w:pPr>
@@ -3152,7 +3152,7 @@
         </w:tc>
         <w:tc>
           <w:tcPr>
-            <w:tcW w:w="1827" w:type="dxa"/>
+            <w:tcW w:w="2210" w:type="dxa"/>
           </w:tcPr>
           <w:p>
             <w:pPr>
@@ -3165,7 +3165,7 @@
         </w:tc>
         <w:tc>
           <w:tcPr>
-            <w:tcW w:w="1827" w:type="dxa"/>
+            <w:tcW w:w="2210" w:type="dxa"/>
           </w:tcPr>
           <w:p>
             <w:pPr>
@@ -3178,7 +3178,7 @@
         </w:tc>
         <w:tc>
           <w:tcPr>
-            <w:tcW w:w="1827" w:type="dxa"/>
+            <w:tcW w:w="2210" w:type="dxa"/>
           </w:tcPr>
           <w:p>
             <w:pPr>
@@ -3193,7 +3193,7 @@
       <w:tr>
         <w:tc>
           <w:tcPr>
-            <w:tcW w:w="2436" w:type="dxa"/>
+            <w:tcW w:w="2946" w:type="dxa"/>
           </w:tcPr>
           <w:p>
             <w:pPr>
@@ -3207,7 +3207,7 @@
         </w:tc>
         <w:tc>
           <w:tcPr>
-            <w:tcW w:w="1827" w:type="dxa"/>
+            <w:tcW w:w="2210" w:type="dxa"/>
           </w:tcPr>
           <w:p>
             <w:pPr>
@@ -3220,7 +3220,7 @@
         </w:tc>
         <w:tc>
           <w:tcPr>
-            <w:tcW w:w="1827" w:type="dxa"/>
+            <w:tcW w:w="2210" w:type="dxa"/>
           </w:tcPr>
           <w:p>
             <w:pPr>
@@ -3246,7 +3246,7 @@
         </w:tc>
         <w:tc>
           <w:tcPr>
-            <w:tcW w:w="1827" w:type="dxa"/>
+            <w:tcW w:w="2210" w:type="dxa"/>
           </w:tcPr>
           <w:p>
             <w:pPr>
@@ -3262,7 +3262,7 @@
       <w:tr>
         <w:tc>
           <w:tcPr>
-            <w:tcW w:w="2436" w:type="dxa"/>
+            <w:tcW w:w="2946" w:type="dxa"/>
           </w:tcPr>
           <w:p>
             <w:pPr>
@@ -3276,7 +3276,7 @@
         </w:tc>
         <w:tc>
           <w:tcPr>
-            <w:tcW w:w="1827" w:type="dxa"/>
+            <w:tcW w:w="2210" w:type="dxa"/>
           </w:tcPr>
           <w:p>
             <w:pPr>
@@ -3289,7 +3289,7 @@
         </w:tc>
         <w:tc>
           <w:tcPr>
-            <w:tcW w:w="1827" w:type="dxa"/>
+            <w:tcW w:w="2210" w:type="dxa"/>
           </w:tcPr>
           <w:p>
             <w:pPr>
@@ -3302,7 +3302,7 @@
         </w:tc>
         <w:tc>
           <w:tcPr>
-            <w:tcW w:w="1827" w:type="dxa"/>
+            <w:tcW w:w="2210" w:type="dxa"/>
           </w:tcPr>
           <w:p>
             <w:pPr>
@@ -3317,7 +3317,7 @@
       <w:tr>
         <w:tc>
           <w:tcPr>
-            <w:tcW w:w="2436" w:type="dxa"/>
+            <w:tcW w:w="2946" w:type="dxa"/>
           </w:tcPr>
           <w:p>
             <w:pPr>
@@ -3331,7 +3331,7 @@
         </w:tc>
         <w:tc>
           <w:tcPr>
-            <w:tcW w:w="1827" w:type="dxa"/>
+            <w:tcW w:w="2210" w:type="dxa"/>
           </w:tcPr>
           <w:p>
             <w:pPr>
@@ -3344,7 +3344,7 @@
         </w:tc>
         <w:tc>
           <w:tcPr>
-            <w:tcW w:w="1827" w:type="dxa"/>
+            <w:tcW w:w="2210" w:type="dxa"/>
           </w:tcPr>
           <w:p>
             <w:pPr>
@@ -3357,7 +3357,7 @@
         </w:tc>
         <w:tc>
           <w:tcPr>
-            <w:tcW w:w="1827" w:type="dxa"/>
+            <w:tcW w:w="2210" w:type="dxa"/>
           </w:tcPr>
           <w:p>
             <w:pPr>
@@ -3372,7 +3372,7 @@
       <w:tr>
         <w:tc>
           <w:tcPr>
-            <w:tcW w:w="2436" w:type="dxa"/>
+            <w:tcW w:w="2946" w:type="dxa"/>
           </w:tcPr>
           <w:p>
             <w:pPr>
@@ -3386,7 +3386,7 @@
         </w:tc>
         <w:tc>
           <w:tcPr>
-            <w:tcW w:w="1827" w:type="dxa"/>
+            <w:tcW w:w="2210" w:type="dxa"/>
           </w:tcPr>
           <w:p>
             <w:pPr>
@@ -3399,7 +3399,7 @@
         </w:tc>
         <w:tc>
           <w:tcPr>
-            <w:tcW w:w="1827" w:type="dxa"/>
+            <w:tcW w:w="2210" w:type="dxa"/>
           </w:tcPr>
           <w:p>
             <w:pPr>
@@ -3448,7 +3448,7 @@
         </w:tc>
         <w:tc>
           <w:tcPr>
-            <w:tcW w:w="1827" w:type="dxa"/>
+            <w:tcW w:w="2210" w:type="dxa"/>
           </w:tcPr>
           <w:p>
             <w:pPr>
@@ -3463,7 +3463,7 @@
       <w:tr>
         <w:tc>
           <w:tcPr>
-            <w:tcW w:w="2436" w:type="dxa"/>
+            <w:tcW w:w="2946" w:type="dxa"/>
           </w:tcPr>
           <w:p>
             <w:pPr>
@@ -3477,7 +3477,7 @@
         </w:tc>
         <w:tc>
           <w:tcPr>
-            <w:tcW w:w="1827" w:type="dxa"/>
+            <w:tcW w:w="2210" w:type="dxa"/>
           </w:tcPr>
           <w:p>
             <w:pPr>
@@ -3490,7 +3490,7 @@
         </w:tc>
         <w:tc>
           <w:tcPr>
-            <w:tcW w:w="1827" w:type="dxa"/>
+            <w:tcW w:w="2210" w:type="dxa"/>
           </w:tcPr>
           <w:p>
             <w:pPr>
@@ -3503,7 +3503,7 @@
         </w:tc>
         <w:tc>
           <w:tcPr>
-            <w:tcW w:w="1827" w:type="dxa"/>
+            <w:tcW w:w="2210" w:type="dxa"/>
           </w:tcPr>
           <w:p>
             <w:pPr>
@@ -3518,7 +3518,7 @@
       <w:tr>
         <w:tc>
           <w:tcPr>
-            <w:tcW w:w="2436" w:type="dxa"/>
+            <w:tcW w:w="2946" w:type="dxa"/>
           </w:tcPr>
           <w:p>
             <w:pPr>
@@ -3532,7 +3532,7 @@
         </w:tc>
         <w:tc>
           <w:tcPr>
-            <w:tcW w:w="1827" w:type="dxa"/>
+            <w:tcW w:w="2210" w:type="dxa"/>
           </w:tcPr>
           <w:p>
             <w:pPr>
@@ -3545,7 +3545,7 @@
         </w:tc>
         <w:tc>
           <w:tcPr>
-            <w:tcW w:w="1827" w:type="dxa"/>
+            <w:tcW w:w="2210" w:type="dxa"/>
           </w:tcPr>
           <w:p>
             <w:pPr>
@@ -3558,7 +3558,7 @@
         </w:tc>
         <w:tc>
           <w:tcPr>
-            <w:tcW w:w="1827" w:type="dxa"/>
+            <w:tcW w:w="2210" w:type="dxa"/>
           </w:tcPr>
           <w:p>
             <w:pPr>
@@ -3573,7 +3573,7 @@
       <w:tr>
         <w:tc>
           <w:tcPr>
-            <w:tcW w:w="2436" w:type="dxa"/>
+            <w:tcW w:w="2946" w:type="dxa"/>
           </w:tcPr>
           <w:p>
             <w:pPr>
@@ -3587,7 +3587,7 @@
         </w:tc>
         <w:tc>
           <w:tcPr>
-            <w:tcW w:w="1827" w:type="dxa"/>
+            <w:tcW w:w="2210" w:type="dxa"/>
           </w:tcPr>
           <w:p>
             <w:pPr>
@@ -3604,7 +3604,7 @@
         </w:tc>
         <w:tc>
           <w:tcPr>
-            <w:tcW w:w="1827" w:type="dxa"/>
+            <w:tcW w:w="2210" w:type="dxa"/>
           </w:tcPr>
           <w:p>
             <w:pPr>
@@ -3622,7 +3622,7 @@
         </w:tc>
         <w:tc>
           <w:tcPr>
-            <w:tcW w:w="1827" w:type="dxa"/>
+            <w:tcW w:w="2210" w:type="dxa"/>
           </w:tcPr>
           <w:p>
             <w:pPr>

</xml_diff>